<commit_message>
feat: actualización de plantillas docx, paso 4 autorización y generador QR
</commit_message>
<xml_diff>
--- a/backend/Plantillas/actaEntrega.docx
+++ b/backend/Plantillas/actaEntrega.docx
@@ -44,7 +44,23 @@
           <w:rFonts w:ascii="Times New Roman" w:hAnsi="Times New Roman" w:cs="Times New Roman"/>
           <w:bCs/>
         </w:rPr>
-        <w:t xml:space="preserve"> Acta, el Gobierno Autónomo Municipal de Charaña, representando Legalmente por el señor Orlando Daniel López Poma Honorable Alcalde Municipal, a través de </w:t>
+        <w:t xml:space="preserve"> Acta, el Gobierno Autónomo Municipal de </w:t>
+      </w:r>
+      <w:proofErr w:type="spellStart"/>
+      <w:r>
+        <w:rPr>
+          <w:rFonts w:ascii="Times New Roman" w:hAnsi="Times New Roman" w:cs="Times New Roman"/>
+          <w:bCs/>
+        </w:rPr>
+        <w:t>Charaña</w:t>
+      </w:r>
+      <w:proofErr w:type="spellEnd"/>
+      <w:r>
+        <w:rPr>
+          <w:rFonts w:ascii="Times New Roman" w:hAnsi="Times New Roman" w:cs="Times New Roman"/>
+          <w:bCs/>
+        </w:rPr>
+        <w:t xml:space="preserve">, representando Legalmente por el señor Orlando Daniel López Poma Honorable Alcalde Municipal, a través de </w:t>
       </w:r>
       <w:r>
         <w:rPr>
@@ -79,7 +95,23 @@
           <w:rFonts w:ascii="Times New Roman" w:hAnsi="Times New Roman" w:cs="Times New Roman"/>
           <w:bCs/>
         </w:rPr>
-        <w:t xml:space="preserve">en fecha:…………………………….. </w:t>
+        <w:t xml:space="preserve">en </w:t>
+      </w:r>
+      <w:proofErr w:type="gramStart"/>
+      <w:r>
+        <w:rPr>
+          <w:rFonts w:ascii="Times New Roman" w:hAnsi="Times New Roman" w:cs="Times New Roman"/>
+          <w:bCs/>
+        </w:rPr>
+        <w:t>fecha:…</w:t>
+      </w:r>
+      <w:proofErr w:type="gramEnd"/>
+      <w:r>
+        <w:rPr>
+          <w:rFonts w:ascii="Times New Roman" w:hAnsi="Times New Roman" w:cs="Times New Roman"/>
+          <w:bCs/>
+        </w:rPr>
+        <w:t xml:space="preserve">………………………….. </w:t>
       </w:r>
       <w:r>
         <w:rPr>
@@ -121,6 +153,7 @@
                 <w:bCs/>
               </w:rPr>
             </w:pPr>
+            <w:proofErr w:type="spellStart"/>
             <w:r>
               <w:rPr>
                 <w:rFonts w:ascii="Times New Roman" w:hAnsi="Times New Roman" w:cs="Times New Roman"/>
@@ -128,6 +161,7 @@
               </w:rPr>
               <w:t>Nº</w:t>
             </w:r>
+            <w:proofErr w:type="spellEnd"/>
           </w:p>
         </w:tc>
         <w:tc>
@@ -238,6 +272,7 @@
                 <w:b/>
               </w:rPr>
             </w:pPr>
+            <w:proofErr w:type="spellStart"/>
             <w:r>
               <w:rPr>
                 <w:rFonts w:ascii="Times New Roman" w:hAnsi="Times New Roman" w:cs="Times New Roman"/>
@@ -245,6 +280,7 @@
               </w:rPr>
               <w:t>nro</w:t>
             </w:r>
+            <w:proofErr w:type="spellEnd"/>
           </w:p>
         </w:tc>
         <w:tc>
@@ -260,6 +296,7 @@
                 <w:bCs/>
               </w:rPr>
             </w:pPr>
+            <w:proofErr w:type="spellStart"/>
             <w:r>
               <w:rPr>
                 <w:rFonts w:ascii="Times New Roman" w:hAnsi="Times New Roman" w:cs="Times New Roman"/>
@@ -267,6 +304,7 @@
               </w:rPr>
               <w:t>desc</w:t>
             </w:r>
+            <w:proofErr w:type="spellEnd"/>
           </w:p>
         </w:tc>
         <w:tc>
@@ -283,6 +321,7 @@
                 <w:bCs/>
               </w:rPr>
             </w:pPr>
+            <w:proofErr w:type="spellStart"/>
             <w:r>
               <w:rPr>
                 <w:rFonts w:ascii="Times New Roman" w:hAnsi="Times New Roman" w:cs="Times New Roman"/>
@@ -290,6 +329,7 @@
               </w:rPr>
               <w:t>cant</w:t>
             </w:r>
+            <w:proofErr w:type="spellEnd"/>
           </w:p>
         </w:tc>
         <w:tc>
@@ -306,6 +346,7 @@
                 <w:bCs/>
               </w:rPr>
             </w:pPr>
+            <w:proofErr w:type="spellStart"/>
             <w:r>
               <w:rPr>
                 <w:rFonts w:ascii="Times New Roman" w:hAnsi="Times New Roman" w:cs="Times New Roman"/>
@@ -313,6 +354,7 @@
               </w:rPr>
               <w:t>unm</w:t>
             </w:r>
+            <w:proofErr w:type="spellEnd"/>
           </w:p>
         </w:tc>
         <w:tc>
@@ -355,7 +397,23 @@
           <w:rFonts w:ascii="Times New Roman" w:hAnsi="Times New Roman" w:cs="Times New Roman"/>
           <w:bCs/>
         </w:rPr>
-        <w:t xml:space="preserve">A: …………………………………………………………….. </w:t>
+        <w:t>A: ………………………………………………………</w:t>
+      </w:r>
+      <w:proofErr w:type="gramStart"/>
+      <w:r>
+        <w:rPr>
+          <w:rFonts w:ascii="Times New Roman" w:hAnsi="Times New Roman" w:cs="Times New Roman"/>
+          <w:bCs/>
+        </w:rPr>
+        <w:t>…….</w:t>
+      </w:r>
+      <w:proofErr w:type="gramEnd"/>
+      <w:r>
+        <w:rPr>
+          <w:rFonts w:ascii="Times New Roman" w:hAnsi="Times New Roman" w:cs="Times New Roman"/>
+          <w:bCs/>
+        </w:rPr>
+        <w:t xml:space="preserve">. </w:t>
       </w:r>
       <w:r>
         <w:rPr>
@@ -363,7 +421,23 @@
           <w:bCs/>
         </w:rPr>
         <w:tab/>
-        <w:t xml:space="preserve">quien ocupa el cargo de ……………………………………………………………….. </w:t>
+        <w:t>quien ocupa el cargo de …………………………………………………………</w:t>
+      </w:r>
+      <w:proofErr w:type="gramStart"/>
+      <w:r>
+        <w:rPr>
+          <w:rFonts w:ascii="Times New Roman" w:hAnsi="Times New Roman" w:cs="Times New Roman"/>
+          <w:bCs/>
+        </w:rPr>
+        <w:t>…….</w:t>
+      </w:r>
+      <w:proofErr w:type="gramEnd"/>
+      <w:r>
+        <w:rPr>
+          <w:rFonts w:ascii="Times New Roman" w:hAnsi="Times New Roman" w:cs="Times New Roman"/>
+          <w:bCs/>
+        </w:rPr>
+        <w:t xml:space="preserve">. </w:t>
       </w:r>
       <w:r>
         <w:rPr>
@@ -487,8 +561,12 @@
       </w:pPr>
     </w:p>
     <w:sectPr>
-      <w:headerReference w:type="default" r:id="rId7"/>
-      <w:footerReference w:type="default" r:id="rId8"/>
+      <w:headerReference w:type="even" r:id="rId7"/>
+      <w:headerReference w:type="default" r:id="rId8"/>
+      <w:footerReference w:type="even" r:id="rId9"/>
+      <w:footerReference w:type="default" r:id="rId10"/>
+      <w:headerReference w:type="first" r:id="rId11"/>
+      <w:footerReference w:type="first" r:id="rId12"/>
       <w:pgSz w:w="12240" w:h="15840" w:code="1"/>
       <w:pgMar w:top="1418" w:right="1418" w:bottom="1418" w:left="1418" w:header="284" w:footer="420" w:gutter="0"/>
       <w:cols w:space="708"/>
@@ -528,6 +606,16 @@
   <w:p>
     <w:pPr>
       <w:pStyle w:val="Piedepgina"/>
+    </w:pPr>
+  </w:p>
+</w:ftr>
+</file>
+
+<file path=word/footer2.xml><?xml version="1.0" encoding="utf-8"?>
+<w:ftr xmlns:wpc="http://schemas.microsoft.com/office/word/2010/wordprocessingCanvas" xmlns:cx="http://schemas.microsoft.com/office/drawing/2014/chartex" xmlns:cx1="http://schemas.microsoft.com/office/drawing/2015/9/8/chartex" xmlns:cx2="http://schemas.microsoft.com/office/drawing/2015/10/21/chartex" xmlns:cx3="http://schemas.microsoft.com/office/drawing/2016/5/9/chartex" xmlns:cx4="http://schemas.microsoft.com/office/drawing/2016/5/10/chartex" xmlns:cx5="http://schemas.microsoft.com/office/drawing/2016/5/11/chartex" xmlns:cx6="http://schemas.microsoft.com/office/drawing/2016/5/12/chartex" xmlns:cx7="http://schemas.microsoft.com/office/drawing/2016/5/13/chartex" xmlns:cx8="http://schemas.microsoft.com/office/drawing/2016/5/14/chartex" xmlns:mc="http://schemas.openxmlformats.org/markup-compatibility/2006" xmlns:aink="http://schemas.microsoft.com/office/drawing/2016/ink" xmlns:am3d="http://schemas.microsoft.com/office/drawing/2017/model3d" xmlns:o="urn:schemas-microsoft-com:office:office" xmlns:oel="http://schemas.microsoft.com/office/2019/extlst" xmlns:r="http://schemas.openxmlformats.org/officeDocument/2006/relationships" xmlns:m="http://schemas.openxmlformats.org/officeDocument/2006/math" xmlns:v="urn:schemas-microsoft-com:vml" xmlns:wp14="http://schemas.microsoft.com/office/word/2010/wordprocessingDrawing" xmlns:wp="http://schemas.openxmlformats.org/drawingml/2006/wordprocessingDrawing" xmlns:w10="urn:schemas-microsoft-com:office:word" xmlns:w="http://schemas.openxmlformats.org/wordprocessingml/2006/main" xmlns:w14="http://schemas.microsoft.com/office/word/2010/wordml" xmlns:w15="http://schemas.microsoft.com/office/word/2012/wordml" xmlns:w16cex="http://schemas.microsoft.com/office/word/2018/wordml/cex" xmlns:w16cid="http://schemas.microsoft.com/office/word/2016/wordml/cid" xmlns:w16="http://schemas.microsoft.com/office/word/2018/wordml" xmlns:w16du="http://schemas.microsoft.com/office/word/2023/wordml/word16du" xmlns:w16sdtdh="http://schemas.microsoft.com/office/word/2020/wordml/sdtdatahash" xmlns:w16se="http://schemas.microsoft.com/office/word/2015/wordml/symex" xmlns:wpg="http://schemas.microsoft.com/office/word/2010/wordprocessingGroup" xmlns:wpi="http://schemas.microsoft.com/office/word/2010/wordprocessingInk" xmlns:wne="http://schemas.microsoft.com/office/word/2006/wordml" xmlns:wps="http://schemas.microsoft.com/office/word/2010/wordprocessingShape" mc:Ignorable="w14 w15 w16se w16cid w16 w16cex w16sdtdh w16du wp14">
+  <w:p>
+    <w:pPr>
+      <w:pStyle w:val="Piedepgina"/>
       <w:tabs>
         <w:tab w:val="clear" w:pos="4252"/>
         <w:tab w:val="clear" w:pos="8504"/>
@@ -571,6 +659,16 @@
       </w:rPr>
       <w:t xml:space="preserve">      gamcharana21.26@gmail.com</w:t>
     </w:r>
+  </w:p>
+</w:ftr>
+</file>
+
+<file path=word/footer3.xml><?xml version="1.0" encoding="utf-8"?>
+<w:ftr xmlns:wpc="http://schemas.microsoft.com/office/word/2010/wordprocessingCanvas" xmlns:cx="http://schemas.microsoft.com/office/drawing/2014/chartex" xmlns:cx1="http://schemas.microsoft.com/office/drawing/2015/9/8/chartex" xmlns:cx2="http://schemas.microsoft.com/office/drawing/2015/10/21/chartex" xmlns:cx3="http://schemas.microsoft.com/office/drawing/2016/5/9/chartex" xmlns:cx4="http://schemas.microsoft.com/office/drawing/2016/5/10/chartex" xmlns:cx5="http://schemas.microsoft.com/office/drawing/2016/5/11/chartex" xmlns:cx6="http://schemas.microsoft.com/office/drawing/2016/5/12/chartex" xmlns:cx7="http://schemas.microsoft.com/office/drawing/2016/5/13/chartex" xmlns:cx8="http://schemas.microsoft.com/office/drawing/2016/5/14/chartex" xmlns:mc="http://schemas.openxmlformats.org/markup-compatibility/2006" xmlns:aink="http://schemas.microsoft.com/office/drawing/2016/ink" xmlns:am3d="http://schemas.microsoft.com/office/drawing/2017/model3d" xmlns:o="urn:schemas-microsoft-com:office:office" xmlns:oel="http://schemas.microsoft.com/office/2019/extlst" xmlns:r="http://schemas.openxmlformats.org/officeDocument/2006/relationships" xmlns:m="http://schemas.openxmlformats.org/officeDocument/2006/math" xmlns:v="urn:schemas-microsoft-com:vml" xmlns:wp14="http://schemas.microsoft.com/office/word/2010/wordprocessingDrawing" xmlns:wp="http://schemas.openxmlformats.org/drawingml/2006/wordprocessingDrawing" xmlns:w10="urn:schemas-microsoft-com:office:word" xmlns:w="http://schemas.openxmlformats.org/wordprocessingml/2006/main" xmlns:w14="http://schemas.microsoft.com/office/word/2010/wordml" xmlns:w15="http://schemas.microsoft.com/office/word/2012/wordml" xmlns:w16cex="http://schemas.microsoft.com/office/word/2018/wordml/cex" xmlns:w16cid="http://schemas.microsoft.com/office/word/2016/wordml/cid" xmlns:w16="http://schemas.microsoft.com/office/word/2018/wordml" xmlns:w16du="http://schemas.microsoft.com/office/word/2023/wordml/word16du" xmlns:w16sdtdh="http://schemas.microsoft.com/office/word/2020/wordml/sdtdatahash" xmlns:w16se="http://schemas.microsoft.com/office/word/2015/wordml/symex" xmlns:wpg="http://schemas.microsoft.com/office/word/2010/wordprocessingGroup" xmlns:wpi="http://schemas.microsoft.com/office/word/2010/wordprocessingInk" xmlns:wne="http://schemas.microsoft.com/office/word/2006/wordml" xmlns:wps="http://schemas.microsoft.com/office/word/2010/wordprocessingShape" mc:Ignorable="w14 w15 w16se w16cid w16 w16cex w16sdtdh w16du wp14">
+  <w:p>
+    <w:pPr>
+      <w:pStyle w:val="Piedepgina"/>
+    </w:pPr>
   </w:p>
 </w:ftr>
 </file>
@@ -604,6 +702,16 @@
 <w:hdr xmlns:wpc="http://schemas.microsoft.com/office/word/2010/wordprocessingCanvas" xmlns:cx="http://schemas.microsoft.com/office/drawing/2014/chartex" xmlns:cx1="http://schemas.microsoft.com/office/drawing/2015/9/8/chartex" xmlns:cx2="http://schemas.microsoft.com/office/drawing/2015/10/21/chartex" xmlns:cx3="http://schemas.microsoft.com/office/drawing/2016/5/9/chartex" xmlns:cx4="http://schemas.microsoft.com/office/drawing/2016/5/10/chartex" xmlns:cx5="http://schemas.microsoft.com/office/drawing/2016/5/11/chartex" xmlns:cx6="http://schemas.microsoft.com/office/drawing/2016/5/12/chartex" xmlns:cx7="http://schemas.microsoft.com/office/drawing/2016/5/13/chartex" xmlns:cx8="http://schemas.microsoft.com/office/drawing/2016/5/14/chartex" xmlns:mc="http://schemas.openxmlformats.org/markup-compatibility/2006" xmlns:aink="http://schemas.microsoft.com/office/drawing/2016/ink" xmlns:am3d="http://schemas.microsoft.com/office/drawing/2017/model3d" xmlns:o="urn:schemas-microsoft-com:office:office" xmlns:oel="http://schemas.microsoft.com/office/2019/extlst" xmlns:r="http://schemas.openxmlformats.org/officeDocument/2006/relationships" xmlns:m="http://schemas.openxmlformats.org/officeDocument/2006/math" xmlns:v="urn:schemas-microsoft-com:vml" xmlns:wp14="http://schemas.microsoft.com/office/word/2010/wordprocessingDrawing" xmlns:wp="http://schemas.openxmlformats.org/drawingml/2006/wordprocessingDrawing" xmlns:w10="urn:schemas-microsoft-com:office:word" xmlns:w="http://schemas.openxmlformats.org/wordprocessingml/2006/main" xmlns:w14="http://schemas.microsoft.com/office/word/2010/wordml" xmlns:w15="http://schemas.microsoft.com/office/word/2012/wordml" xmlns:w16cex="http://schemas.microsoft.com/office/word/2018/wordml/cex" xmlns:w16cid="http://schemas.microsoft.com/office/word/2016/wordml/cid" xmlns:w16="http://schemas.microsoft.com/office/word/2018/wordml" xmlns:w16du="http://schemas.microsoft.com/office/word/2023/wordml/word16du" xmlns:w16sdtdh="http://schemas.microsoft.com/office/word/2020/wordml/sdtdatahash" xmlns:w16se="http://schemas.microsoft.com/office/word/2015/wordml/symex" xmlns:wpg="http://schemas.microsoft.com/office/word/2010/wordprocessingGroup" xmlns:wpi="http://schemas.microsoft.com/office/word/2010/wordprocessingInk" xmlns:wne="http://schemas.microsoft.com/office/word/2006/wordml" xmlns:wps="http://schemas.microsoft.com/office/word/2010/wordprocessingShape" mc:Ignorable="w14 w15 w16se w16cid w16 w16cex w16sdtdh w16du wp14">
   <w:p>
     <w:pPr>
+      <w:pStyle w:val="Encabezado"/>
+    </w:pPr>
+  </w:p>
+</w:hdr>
+</file>
+
+<file path=word/header2.xml><?xml version="1.0" encoding="utf-8"?>
+<w:hdr xmlns:wpc="http://schemas.microsoft.com/office/word/2010/wordprocessingCanvas" xmlns:cx="http://schemas.microsoft.com/office/drawing/2014/chartex" xmlns:cx1="http://schemas.microsoft.com/office/drawing/2015/9/8/chartex" xmlns:cx2="http://schemas.microsoft.com/office/drawing/2015/10/21/chartex" xmlns:cx3="http://schemas.microsoft.com/office/drawing/2016/5/9/chartex" xmlns:cx4="http://schemas.microsoft.com/office/drawing/2016/5/10/chartex" xmlns:cx5="http://schemas.microsoft.com/office/drawing/2016/5/11/chartex" xmlns:cx6="http://schemas.microsoft.com/office/drawing/2016/5/12/chartex" xmlns:cx7="http://schemas.microsoft.com/office/drawing/2016/5/13/chartex" xmlns:cx8="http://schemas.microsoft.com/office/drawing/2016/5/14/chartex" xmlns:mc="http://schemas.openxmlformats.org/markup-compatibility/2006" xmlns:aink="http://schemas.microsoft.com/office/drawing/2016/ink" xmlns:am3d="http://schemas.microsoft.com/office/drawing/2017/model3d" xmlns:o="urn:schemas-microsoft-com:office:office" xmlns:oel="http://schemas.microsoft.com/office/2019/extlst" xmlns:r="http://schemas.openxmlformats.org/officeDocument/2006/relationships" xmlns:m="http://schemas.openxmlformats.org/officeDocument/2006/math" xmlns:v="urn:schemas-microsoft-com:vml" xmlns:wp14="http://schemas.microsoft.com/office/word/2010/wordprocessingDrawing" xmlns:wp="http://schemas.openxmlformats.org/drawingml/2006/wordprocessingDrawing" xmlns:w10="urn:schemas-microsoft-com:office:word" xmlns:w="http://schemas.openxmlformats.org/wordprocessingml/2006/main" xmlns:w14="http://schemas.microsoft.com/office/word/2010/wordml" xmlns:w15="http://schemas.microsoft.com/office/word/2012/wordml" xmlns:w16cex="http://schemas.microsoft.com/office/word/2018/wordml/cex" xmlns:w16cid="http://schemas.microsoft.com/office/word/2016/wordml/cid" xmlns:w16="http://schemas.microsoft.com/office/word/2018/wordml" xmlns:w16du="http://schemas.microsoft.com/office/word/2023/wordml/word16du" xmlns:w16sdtdh="http://schemas.microsoft.com/office/word/2020/wordml/sdtdatahash" xmlns:w16se="http://schemas.microsoft.com/office/word/2015/wordml/symex" xmlns:wpg="http://schemas.microsoft.com/office/word/2010/wordprocessingGroup" xmlns:wpi="http://schemas.microsoft.com/office/word/2010/wordprocessingInk" xmlns:wne="http://schemas.microsoft.com/office/word/2006/wordml" xmlns:wps="http://schemas.microsoft.com/office/word/2010/wordprocessingShape" mc:Ignorable="w14 w15 w16se w16cid w16 w16cex w16sdtdh w16du wp14">
+  <w:p>
+    <w:pPr>
       <w:pStyle w:val="Sinespaciado"/>
       <w:tabs>
         <w:tab w:val="left" w:pos="4111"/>
@@ -625,7 +733,7 @@
         <w:sz w:val="28"/>
       </w:rPr>
       <w:drawing>
-        <wp:anchor distT="0" distB="0" distL="114300" distR="114300" simplePos="0" relativeHeight="251656704" behindDoc="0" locked="0" layoutInCell="1" allowOverlap="1" wp14:anchorId="289689CE" wp14:editId="097982F8">
+        <wp:anchor distT="0" distB="0" distL="114300" distR="114300" simplePos="0" relativeHeight="251656704" behindDoc="0" locked="0" layoutInCell="1" allowOverlap="1" wp14:anchorId="289689CE" wp14:editId="7B519BB0">
           <wp:simplePos x="0" y="0"/>
           <wp:positionH relativeFrom="page">
             <wp:posOffset>6105525</wp:posOffset>
@@ -650,10 +758,10 @@
                   </pic:cNvPicPr>
                 </pic:nvPicPr>
                 <pic:blipFill>
-                  <a:blip r:embed="rId1">
+                  <a:blip r:embed="rId1" cstate="print">
                     <a:extLst>
                       <a:ext uri="{28A0092B-C50C-407E-A947-70E740481C1C}">
-                        <a14:useLocalDpi xmlns:a14="http://schemas.microsoft.com/office/drawing/2010/main" val="0"/>
+                        <a14:useLocalDpi xmlns:a14="http://schemas.microsoft.com/office/drawing/2010/main"/>
                       </a:ext>
                     </a:extLst>
                   </a:blip>
@@ -710,7 +818,7 @@
         <w:lang w:val="es-ES" w:eastAsia="es-ES"/>
       </w:rPr>
       <w:drawing>
-        <wp:anchor distT="0" distB="0" distL="114300" distR="114300" simplePos="0" relativeHeight="251657728" behindDoc="0" locked="0" layoutInCell="1" allowOverlap="1" wp14:anchorId="79FB212D" wp14:editId="7BACE956">
+        <wp:anchor distT="0" distB="0" distL="114300" distR="114300" simplePos="0" relativeHeight="251657728" behindDoc="0" locked="0" layoutInCell="1" allowOverlap="1" wp14:anchorId="79FB212D" wp14:editId="5AFB71EE">
           <wp:simplePos x="0" y="0"/>
           <wp:positionH relativeFrom="page">
             <wp:posOffset>76200</wp:posOffset>
@@ -735,10 +843,10 @@
                   </pic:cNvPicPr>
                 </pic:nvPicPr>
                 <pic:blipFill>
-                  <a:blip r:embed="rId2">
+                  <a:blip r:embed="rId2" cstate="print">
                     <a:extLst>
                       <a:ext uri="{28A0092B-C50C-407E-A947-70E740481C1C}">
-                        <a14:useLocalDpi xmlns:a14="http://schemas.microsoft.com/office/drawing/2010/main" val="0"/>
+                        <a14:useLocalDpi xmlns:a14="http://schemas.microsoft.com/office/drawing/2010/main"/>
                       </a:ext>
                     </a:extLst>
                   </a:blip>
@@ -887,8 +995,18 @@
         <w:color w:val="1F3864" w:themeColor="accent1" w:themeShade="80"/>
         <w:sz w:val="28"/>
       </w:rPr>
-      <w:t>Provincia Pacajes</w:t>
+      <w:t xml:space="preserve">Provincia </w:t>
     </w:r>
+    <w:proofErr w:type="spellStart"/>
+    <w:r>
+      <w:rPr>
+        <w:rFonts w:ascii="Adobe Garamond Pro" w:hAnsi="Adobe Garamond Pro"/>
+        <w:color w:val="1F3864" w:themeColor="accent1" w:themeShade="80"/>
+        <w:sz w:val="28"/>
+      </w:rPr>
+      <w:t>Pacajes</w:t>
+    </w:r>
+    <w:proofErr w:type="spellEnd"/>
   </w:p>
   <w:p>
     <w:pPr>
@@ -937,6 +1055,16 @@
         <w:rFonts w:ascii="Adobe Garamond Pro" w:hAnsi="Adobe Garamond Pro"/>
         <w:color w:val="1F3864" w:themeColor="accent1" w:themeShade="80"/>
       </w:rPr>
+    </w:pPr>
+  </w:p>
+</w:hdr>
+</file>
+
+<file path=word/header3.xml><?xml version="1.0" encoding="utf-8"?>
+<w:hdr xmlns:wpc="http://schemas.microsoft.com/office/word/2010/wordprocessingCanvas" xmlns:cx="http://schemas.microsoft.com/office/drawing/2014/chartex" xmlns:cx1="http://schemas.microsoft.com/office/drawing/2015/9/8/chartex" xmlns:cx2="http://schemas.microsoft.com/office/drawing/2015/10/21/chartex" xmlns:cx3="http://schemas.microsoft.com/office/drawing/2016/5/9/chartex" xmlns:cx4="http://schemas.microsoft.com/office/drawing/2016/5/10/chartex" xmlns:cx5="http://schemas.microsoft.com/office/drawing/2016/5/11/chartex" xmlns:cx6="http://schemas.microsoft.com/office/drawing/2016/5/12/chartex" xmlns:cx7="http://schemas.microsoft.com/office/drawing/2016/5/13/chartex" xmlns:cx8="http://schemas.microsoft.com/office/drawing/2016/5/14/chartex" xmlns:mc="http://schemas.openxmlformats.org/markup-compatibility/2006" xmlns:aink="http://schemas.microsoft.com/office/drawing/2016/ink" xmlns:am3d="http://schemas.microsoft.com/office/drawing/2017/model3d" xmlns:o="urn:schemas-microsoft-com:office:office" xmlns:oel="http://schemas.microsoft.com/office/2019/extlst" xmlns:r="http://schemas.openxmlformats.org/officeDocument/2006/relationships" xmlns:m="http://schemas.openxmlformats.org/officeDocument/2006/math" xmlns:v="urn:schemas-microsoft-com:vml" xmlns:wp14="http://schemas.microsoft.com/office/word/2010/wordprocessingDrawing" xmlns:wp="http://schemas.openxmlformats.org/drawingml/2006/wordprocessingDrawing" xmlns:w10="urn:schemas-microsoft-com:office:word" xmlns:w="http://schemas.openxmlformats.org/wordprocessingml/2006/main" xmlns:w14="http://schemas.microsoft.com/office/word/2010/wordml" xmlns:w15="http://schemas.microsoft.com/office/word/2012/wordml" xmlns:w16cex="http://schemas.microsoft.com/office/word/2018/wordml/cex" xmlns:w16cid="http://schemas.microsoft.com/office/word/2016/wordml/cid" xmlns:w16="http://schemas.microsoft.com/office/word/2018/wordml" xmlns:w16du="http://schemas.microsoft.com/office/word/2023/wordml/word16du" xmlns:w16sdtdh="http://schemas.microsoft.com/office/word/2020/wordml/sdtdatahash" xmlns:w16se="http://schemas.microsoft.com/office/word/2015/wordml/symex" xmlns:wpg="http://schemas.microsoft.com/office/word/2010/wordprocessingGroup" xmlns:wpi="http://schemas.microsoft.com/office/word/2010/wordprocessingInk" xmlns:wne="http://schemas.microsoft.com/office/word/2006/wordml" xmlns:wps="http://schemas.microsoft.com/office/word/2010/wordprocessingShape" mc:Ignorable="w14 w15 w16se w16cid w16 w16cex w16sdtdh w16du wp14">
+  <w:p>
+    <w:pPr>
+      <w:pStyle w:val="Encabezado"/>
     </w:pPr>
   </w:p>
 </w:hdr>

</xml_diff>